<commit_message>
Achse 2 auf Nachweis-Kriterium umgestellt: Einzelstoichiometrie genuegt
Neue Lesart: Ist Schalten an Edelmetall-Grenzflaeche fuer einzelne
Stoichiometrien nachgewiesen, kann das Projekt Kovalenz-Korrelation UND
Stoichiometrie-Optimierung untersuchen; fehlende Serien sind Projektraum,
kein Machbarkeitsrisiko. Neubewertung: erfuellt bei STF (Pt-Basis + Sr/Ti-
Serie), PCMO (Pt/Pt delta-abhaengig, Kramer 2017) und LSFO (Endglieder
unter Au/SrRuO3); nicht erfuellt bei LSMO (kein Nachweis) und LNO (nur
TiN). PCMO und LSFO dadurch deutlich aufgewertet. Antraege angepasst:
Optimierungs-Dimension in Lynen-PCMO/-LSFO ergaenzt; EN-Ketten-Absatz
(Ferrit-Endglieder als Optimierungsraum, Manganit-Aussage auf LSMO
praezisiert) und ERC-Ketten-Satz entsprechend umgestellt.

Co-Authored-By: Claude Fable 5 <noreply@anthropic.com>
Claude-Session: https://claude.ai/code/session_01Bk7Pr8s2NdP1JMtzGzdQap
</commit_message>
<xml_diff>
--- a/Materialsysteme_Vergleich.docx
+++ b/Materialsysteme_Vergleich.docx
@@ -62,7 +62,7 @@
         <w:spacing w:after="100"/>
       </w:pPr>
       <w:r>
-        <w:t xml:space="preserve">Achse 2 – Resistives Schalten an der Edelmetall-Grenzfläche vs. Stöchiometrie: Wie gut ist belegt, dass das Material an einer inerten Edelmetall-Grenzfläche (Pt, Au, Graphen) resistiv schaltet, und dass dieses Schalten von der Stöchiometrie (und damit der Kovalenz) abhängt? Nur an inerten Grenzflächen bleibt die Sauerstoffbilanz im Oxid, sodass die Kovalenz – und nicht die Elektrodenchemie – die gemessene Variable ist.</w:t>
+        <w:t xml:space="preserve">Achse 2 – Resistives Schalten an der Edelmetall-Grenzfläche: Ist für das Material nachgewiesen, dass es an einer inerten Edelmetall-Grenzfläche (Pt, Au, Graphen) resistiv schaltet? Kriterium: Der Nachweis für einzelne Stöchiometrien genügt. Existiert er, kann das Projekt auf dieser Basis beides untersuchen – den Zusammenhang mit der Kovalenz und die Optimierung des Schaltens über die Stöchiometrie; die fehlende Kompositionsserie ist dann Projektraum, kein Machbarkeitsrisiko. Nur wo der Nachweis ganz fehlt, steht vor der Deskriptorstudie ein Machbarkeitsschritt. (Hintergrund: Nur an inerten Grenzflächen bleibt die Sauerstoffbilanz im Oxid, sodass die Kovalenz – und nicht die Elektrodenchemie – die gemessene Variable ist.)</w:t>
       </w:r>
     </w:p>
     <w:p>
@@ -295,7 +295,7 @@
                 <w:sz w:val="16"/>
                 <w:szCs w:val="16"/>
               </w:rPr>
-              <w:t xml:space="preserve">Am besten belegt von allen fünf Systemen: Schalten an der Pt-Grenzfläche mechanistisch etabliert (Muenstermann 2010; Sarantopoulos 2024 – beide Pt/Fe:STO/Nb:STO; Rolle der Pt-Platzierung kontrolliert, Sediva 2019). Stöchiometrie-gesteuertes Schalten an Pt direkt demonstriert – allerdings für die Kationen-Stöchiometrie Sr/Ti (Mikheev 2015), noch nicht für den Fe-Gehalt. Fe-Serie an inerten Elektroden fehlt (Kernlücke, bestätigt Aug 2026).</w:t>
+              <w:t xml:space="preserve">Erfüllt – am stärksten: Schalten an der Pt-Grenzfläche mehrfach nachgewiesen und mechanistisch etabliert (Muenstermann 2010; Sarantopoulos 2024; Pt-Platzierung kontrolliert, Sediva 2019); mit Mikheev 2015 existiert sogar eine Stöchiometrieserie an Pt (Sr/Ti-Kationenstöchiometrie). Die fehlende Fe-Serie ist reiner Projektraum: Kovalenz-Korrelation plus Stöchiometrie-Optimierung auf nachgewiesener Basis.</w:t>
             </w:r>
           </w:p>
         </w:tc>
@@ -317,7 +317,7 @@
                 <w:sz w:val="16"/>
                 <w:szCs w:val="16"/>
               </w:rPr>
-              <w:t xml:space="preserve">Empfehlung bestätigt: stark auf 1b und 2 (die beiden entscheidenden Glieder), solide auf 1a; verbleibende Lücken sind exakt der Antragsinhalt. Risikoärmster Start.</w:t>
+              <w:t xml:space="preserve">Empfehlung bestätigt: alle drei Glieder mindestens solide, 1b und 2 führend; das Projekt startet auf nachgewiesener Edelmetall-Basis direkt mit Korrelation und Stöchiometrie-Optimierung. Risikoärmster Start.</w:t>
             </w:r>
           </w:p>
         </w:tc>
@@ -407,7 +407,7 @@
                 <w:sz w:val="16"/>
                 <w:szCs w:val="16"/>
               </w:rPr>
-              <w:t xml:space="preserve">Widersprüchlich belegt: Die einzige komplette x-Serie (Asanuma 2009) läuft über die reaktive Ti-Grenzfläche; an Au verschwindet die Hysterese (Nakamura 2013, Elektrodenserie Al/Ni/Ag/Au auf Pt/PCMO). Aber: Pt/PCMO/Pt-Zellen schalten nachweislich – δ-abhängig, mit STEM-EELS-Beleg der O-Migration ohne reaktive Elektrode (Kramer 2017). Edelmetall-Schalten möglich, aber schwächer, und als Ca-x-Serie unbelegt.</w:t>
+              <w:t xml:space="preserve">Erfüllt: Schalten an der Edelmetall-Grenzfläche ist für eine Einzelstöchiometrie nachgewiesen – Pt/PCMO/Pt (x = 0,33) schaltet δ-abhängig, mit STEM-EELS-Beleg interner O-Migration (Kramer 2017). Einschränkungen: an offenen Au-Kontakten keine Hysterese (Nakamura 2013), Effekte schwächer als mit reaktivem Ti (Asanuma 2009). Die Ca-Serie an Pt ist offen – und damit der Optimierungsraum des Projekts.</w:t>
             </w:r>
           </w:p>
         </w:tc>
@@ -429,7 +429,7 @@
                 <w:sz w:val="16"/>
                 <w:szCs w:val="16"/>
               </w:rPr>
-              <w:t xml:space="preserve">Persönliches De-Risking (eigene Kernexpertise), aber alle drei Beleg-Glieder lückenhaft; Kramer 2017 macht die Edelmetall-Route realistischer – Aufnahme ins PCMO-Set empfohlen.</w:t>
+              <w:t xml:space="preserve">Deutlich aufgewertet: Achse 2 erfüllt (Kramer 2017) plus eigene Kernexpertise; die Schwächen liegen klar lokalisierbar auf 1a/1b (Deskriptorachsen im Projekt selbst zu vermessen). Solide De-Risking-Option mit Korrelations- und Optimierungsperspektive.</w:t>
             </w:r>
           </w:p>
         </w:tc>
@@ -519,7 +519,7 @@
                 <w:sz w:val="16"/>
                 <w:szCs w:val="16"/>
               </w:rPr>
-              <w:t xml:space="preserve">Nur Endglieder: SrFeO2.5/SrFeOx schaltet unter inerten Stapeln (Au-Top/SrRuO3-Boden: Nallagatla 2019, Tian 2019, Rao 2021) – Mechanismus ist der topotaktische Volumen-Phasenübergang, nicht primär die Edelmetall-Grenzflächenbarriere; LaFeO3 rudimentär (Aljurays 2023). Für 0 &lt; x &lt; 1 keine einzige Memristor-Studie (bestätigt Aug 2026).</w:t>
+              <w:t xml:space="preserve">Erfüllt an den Endgliedern: SrFeO2.5/SrFeOx schaltet unter inerten Au/SrRuO3-Stapeln (Nallagatla 2019, Tian 2019, Rao 2021; topotaktischer Volumenmechanismus), LaFeO3 rudimentär (Aljurays 2023). Für 0 &lt; x &lt; 1 keine Studie – unter dem Nachweis-Kriterium kein Machbarkeitsrisiko, sondern der größte unerschlossene Optimierungsraum des Feldes.</w:t>
             </w:r>
           </w:p>
         </w:tc>
@@ -541,7 +541,7 @@
                 <w:sz w:val="16"/>
                 <w:szCs w:val="16"/>
               </w:rPr>
-              <w:t xml:space="preserve">Ausgewogen stärkstes Deskriptor-Fundament (1a exzellent + 1b quantitativ) bei maximal offener Achse 2 – größter Erkenntnisgewinn, mittleres Risiko (Topotaktik am Sr-Ende als kartierbare Grenze).</w:t>
+              <w:t xml:space="preserve">Deskriptor-Fundament komplett (1a exzellent, 1b quantitativ) und Achse 2 an den Endgliedern erfüllt – die unbelegte Zwischenserie ist Optimierungsraum, nicht Machbarkeitsrisiko. Stärkste Wahl fürs Gruppenprogramm; Topotaktik am Sr-Ende als kartierbare Grenze.</w:t>
             </w:r>
           </w:p>
         </w:tc>
@@ -631,7 +631,7 @@
                 <w:sz w:val="16"/>
                 <w:szCs w:val="16"/>
               </w:rPr>
-              <w:t xml:space="preserve">Schwächste Beleglage: kein Edelmetall-Grenzflächen-Schalten dokumentiert. Die einzige x-Serie (Choi 2013, x = 0,1/0,3/0,5) läuft über reaktives Al-Top (Pt nur Rückelektrode); Moreno 2010 ist spitzenbasiert (explizit kein Zwei-Elektroden-Device); neuere Einzelstudien nutzen aktives Ag (Liu 2024). Edelmetall-Schalten wäre von Grund auf neu zu etablieren.</w:t>
+              <w:t xml:space="preserve">Nicht erfüllt: kein LSMO-Schalten an einer Edelmetall-Grenzfläche für irgendeine Stöchiometrie berichtet – die einzige x-Serie (Choi 2013) läuft über reaktives Al-Top, Moreno 2010 ist spitzenbasiert, Liu 2024 nutzt aktives Ag. Vor Korrelation oder Optimierung stünde hier erst der Grundnachweis.</w:t>
             </w:r>
           </w:p>
         </w:tc>
@@ -653,7 +653,7 @@
                 <w:sz w:val="16"/>
                 <w:szCs w:val="16"/>
               </w:rPr>
-              <w:t xml:space="preserve">Stärkste 1a-Achse, aber 1b dünn und Achse 2 bei null – die Beleg-Kette bricht genau an den projektkritischen Gliedern; höchster Etablierungsaufwand.</w:t>
+              <w:t xml:space="preserve">Stärkste 1a-Achse, aber 1b dünn und Achse 2 nicht erfüllt – einziges Perowskit-System des Portfolios, das den Edelmetall-Grundnachweis erst erbringen müsste; höchster Etablierungsaufwand.</w:t>
             </w:r>
           </w:p>
         </w:tc>
@@ -743,7 +743,7 @@
                 <w:sz w:val="16"/>
                 <w:szCs w:val="16"/>
               </w:rPr>
-              <w:t xml:space="preserve">δ-Abhängigkeit des Schaltens als Serie belegt (Koroleva 2024: δ wählt filamentär vs. Interface-Typ) – aber an der reaktiven TiN-Grenzfläche (Pt nur passive Rückelektrode); TiN-frei nur als interner Oxid/Oxid-Kontakt (Maas 2022). Schalten an aktiver Edelmetall-Grenzfläche: nicht gezeigt – die offene Kernfrage des LNO-Sets (Entscheidungstor Monat 12).</w:t>
+              <w:t xml:space="preserve">Nicht erfüllt (für Edelmetall): δ-Serie existiert (Koroleva 2024: δ wählt filamentär vs. Interface-Typ), aber an der reaktiven TiN-Grenzfläche; TiN-frei nur als interner Oxid/Oxid-Kontakt (Maas 2022). Für keine (δ, x)-Stöchiometrie an Edelmetall nachgewiesen – bleibt die offene Kernfrage mit Entscheidungstor (Monat 12).</w:t>
             </w:r>
           </w:p>
         </w:tc>
@@ -765,7 +765,7 @@
                 <w:sz w:val="16"/>
                 <w:szCs w:val="16"/>
               </w:rPr>
-              <w:t xml:space="preserve">High-Risk/High-Gain: 1a stark, 2 teilweise (δ-Serie, falsche Grenzfläche), 1b völlig offen – wissenschaftlich reizvoll, aber zwei Kettenglieder gleichzeitig unbelegt.</w:t>
+              <w:t xml:space="preserve">High-Risk/High-Gain: 1a stark, aber 1b und der Edelmetall-Nachweis (Achse 2) gleichzeitig offen – wissenschaftlich reizvoll, nur mit robustem Entscheidungstor wählen.</w:t>
             </w:r>
           </w:p>
         </w:tc>
@@ -801,7 +801,7 @@
         <w:spacing w:after="100"/>
       </w:pPr>
       <w:r>
-        <w:t xml:space="preserve">Rangfolge Achse 2 (Edelmetall-Schalten vs. Stöchiometrie): STF (Pt-Grenzfläche etabliert + Stöchiometrieserie an Pt, Mikheev 2015 – für Sr/Ti statt Fe) &gt; LSFO (Endglieder unter Au/SrRuO3, keine Serie) &gt; PCMO (Pt/Pt-Schalten δ-abhängig gezeigt, Kramer 2017; x-Serie nur mit Ti) &gt; LNO (δ-Serie, aber TiN-Grenzfläche) &gt; LSMO (nichts an Edelmetall).</w:t>
+        <w:t xml:space="preserve">Achse 2 unter dem Nachweis-Kriterium (Einzelstöchiometrie genügt): Erfüllt bei STF (Pt-Basis mehrfach nachgewiesen, dazu Sr/Ti-Serie an Pt), PCMO (Pt/Pt, δ-abhängig, Kramer 2017) und LSFO (Endglieder unter Au/SrRuO3); nicht erfüllt bei LNO (nur TiN) und LSMO (kein Nachweis für irgendeine Stöchiometrie). Für die drei erfüllten Systeme wird die fehlende Kompositionsserie vom Risiko zum Projektinhalt: Korrelation mit der Kovalenz plus Optimierung des Schaltens über die Stöchiometrie.</w:t>
       </w:r>
     </w:p>
     <w:p>
@@ -809,7 +809,7 @@
         <w:spacing w:after="100"/>
       </w:pPr>
       <w:r>
-        <w:t xml:space="preserve">Lesart der Kette: Kein System ist auf allen drei Gliedern stark. STF ist das einzige System, das auf den beiden projektkritischen Gliedern (1b und 2) führt – bei solider, wenn auch subtiler 1a-Achse; die Antrags-Lücken (direkte Kovalenz↔EV-Korrelation, Fe-Serie an Pt) schließen exakt die verbleibenden Kettenglieder. LSFO hat das ausgewogenste Deskriptor-Fundament (1a exzellent, 1b quantitativ) und die am klarsten offene Achse 2 – ideal für das Gruppenprogramm, wo die Serie erst gebaut wird. LSMO illustriert die Schere: beste 1a-Achse des Feldes, aber 1b dünn und Achse 2 bei null. PCMO ist auf allen Gliedern lückenhaft, gewinnt aber durch Kramer 2017 eine realistische Edelmetall-Route. LNO hat als einziges System zwei gleichzeitig unbelegte Glieder (1b und Edelmetall-Teil von 2) – der High-Gain-Fall mit Entscheidungstor.</w:t>
+        <w:t xml:space="preserve">Lesart der Kette: Drei Systeme (STF, PCMO, LSFO) haben den Edelmetall-Nachweis und damit eine belastbare Startbasis – ihre Projekte können unmittelbar Korrelation und Stöchiometrie-Optimierung verfolgen. STF führt zusätzlich auf 1b und hat als einziges auch eine Stöchiometrieserie an Pt (Sr/Ti); seine Lücken (direkte Kovalenz↔EV-Korrelation, Fe-Serie) sind exakt der Antragsinhalt. LSFO kombiniert das komplette Deskriptor-Fundament (1a exzellent, 1b quantitativ) mit erfüllter Achse 2 an den Endgliedern – die Zwischenserie ist der größte Optimierungsraum des Feldes. PCMO bleibt auf 1a/1b am dünnsten, hat aber Nachweis und Eigenexpertise. LSMO (kein Edelmetall-Nachweis, 1b dünn) und LNO (1b und Edelmetall-Nachweis offen) tragen dagegen einen Machbarkeitsschritt vor der Deskriptorstudie.</w:t>
       </w:r>
     </w:p>
     <w:p>

</xml_diff>